<commit_message>
docs: add real development timeline and Gantt data to both documentation files
</commit_message>
<xml_diff>
--- a/DAW_Defending_a_Workstation_TFG.docx
+++ b/DAW_Defending_a_Workstation_TFG.docx
@@ -972,6 +972,1192 @@
     </w:p>
     <w:p>
       <w:pPr>
+        <w:spacing w:after="120"/>
+      </w:pPr>
+      <w:r>
+        <w:rPr>
+          <w:b w:val="0"/>
+          <w:i w:val="0"/>
+        </w:rPr>
+        <w:t>La siguiente tabla recoge todas las tareas del proyecto con sus fechas reales de inicio y fin, derivadas del historial de commits del repositorio. Estos datos están listos para importar directamente en Excel, Google Sheets o cualquier herramienta de diagramas de Gantt (ProjectLibre, GanttProject, etc.).</w:t>
+      </w:r>
+    </w:p>
+    <w:tbl>
+      <w:tblPr>
+        <w:tblStyle w:val="TableGrid"/>
+        <w:tblW w:type="auto" w:w="0"/>
+        <w:tblLook w:firstColumn="1" w:firstRow="1" w:lastColumn="0" w:lastRow="0" w:noHBand="0" w:noVBand="1" w:val="04A0"/>
+      </w:tblPr>
+      <w:tblGrid>
+        <w:gridCol w:w="1824"/>
+        <w:gridCol w:w="1824"/>
+        <w:gridCol w:w="1824"/>
+        <w:gridCol w:w="1824"/>
+        <w:gridCol w:w="1824"/>
+      </w:tblGrid>
+      <w:tr>
+        <w:tc>
+          <w:tcPr>
+            <w:tcW w:type="dxa" w:w="1824"/>
+          </w:tcPr>
+          <w:p>
+            <w:r>
+              <w:rPr>
+                <w:b/>
+              </w:rPr>
+              <w:t>Fase</w:t>
+            </w:r>
+          </w:p>
+        </w:tc>
+        <w:tc>
+          <w:tcPr>
+            <w:tcW w:type="dxa" w:w="1824"/>
+          </w:tcPr>
+          <w:p>
+            <w:r>
+              <w:rPr>
+                <w:b/>
+              </w:rPr>
+              <w:t>Tarea</w:t>
+            </w:r>
+          </w:p>
+        </w:tc>
+        <w:tc>
+          <w:tcPr>
+            <w:tcW w:type="dxa" w:w="1824"/>
+          </w:tcPr>
+          <w:p>
+            <w:r>
+              <w:rPr>
+                <w:b/>
+              </w:rPr>
+              <w:t>Inicio</w:t>
+            </w:r>
+          </w:p>
+        </w:tc>
+        <w:tc>
+          <w:tcPr>
+            <w:tcW w:type="dxa" w:w="1824"/>
+          </w:tcPr>
+          <w:p>
+            <w:r>
+              <w:rPr>
+                <w:b/>
+              </w:rPr>
+              <w:t>Fin</w:t>
+            </w:r>
+          </w:p>
+        </w:tc>
+        <w:tc>
+          <w:tcPr>
+            <w:tcW w:type="dxa" w:w="1824"/>
+          </w:tcPr>
+          <w:p>
+            <w:r>
+              <w:rPr>
+                <w:b/>
+              </w:rPr>
+              <w:t>Días</w:t>
+            </w:r>
+          </w:p>
+        </w:tc>
+      </w:tr>
+      <w:tr>
+        <w:tc>
+          <w:tcPr>
+            <w:tcW w:type="dxa" w:w="1824"/>
+          </w:tcPr>
+          <w:p>
+            <w:r>
+              <w:t>1. Planning</w:t>
+            </w:r>
+          </w:p>
+        </w:tc>
+        <w:tc>
+          <w:tcPr>
+            <w:tcW w:type="dxa" w:w="1824"/>
+          </w:tcPr>
+          <w:p>
+            <w:r>
+              <w:t>Análisis de requisitos y estudio de tecnologías</w:t>
+            </w:r>
+          </w:p>
+        </w:tc>
+        <w:tc>
+          <w:tcPr>
+            <w:tcW w:type="dxa" w:w="1824"/>
+          </w:tcPr>
+          <w:p>
+            <w:r>
+              <w:t>01/03/2026</w:t>
+            </w:r>
+          </w:p>
+        </w:tc>
+        <w:tc>
+          <w:tcPr>
+            <w:tcW w:type="dxa" w:w="1824"/>
+          </w:tcPr>
+          <w:p>
+            <w:r>
+              <w:t>10/03/2026</w:t>
+            </w:r>
+          </w:p>
+        </w:tc>
+        <w:tc>
+          <w:tcPr>
+            <w:tcW w:type="dxa" w:w="1824"/>
+          </w:tcPr>
+          <w:p>
+            <w:r>
+              <w:t>10</w:t>
+            </w:r>
+          </w:p>
+        </w:tc>
+      </w:tr>
+      <w:tr>
+        <w:tc>
+          <w:tcPr>
+            <w:tcW w:type="dxa" w:w="1824"/>
+          </w:tcPr>
+          <w:p>
+            <w:r>
+              <w:t>1. Planning</w:t>
+            </w:r>
+          </w:p>
+        </w:tc>
+        <w:tc>
+          <w:tcPr>
+            <w:tcW w:type="dxa" w:w="1824"/>
+          </w:tcPr>
+          <w:p>
+            <w:r>
+              <w:t>Decisiones de arquitectura (3 capas, REST, SPA)</w:t>
+            </w:r>
+          </w:p>
+        </w:tc>
+        <w:tc>
+          <w:tcPr>
+            <w:tcW w:type="dxa" w:w="1824"/>
+          </w:tcPr>
+          <w:p>
+            <w:r>
+              <w:t>10/03/2026</w:t>
+            </w:r>
+          </w:p>
+        </w:tc>
+        <w:tc>
+          <w:tcPr>
+            <w:tcW w:type="dxa" w:w="1824"/>
+          </w:tcPr>
+          <w:p>
+            <w:r>
+              <w:t>17/03/2026</w:t>
+            </w:r>
+          </w:p>
+        </w:tc>
+        <w:tc>
+          <w:tcPr>
+            <w:tcW w:type="dxa" w:w="1824"/>
+          </w:tcPr>
+          <w:p>
+            <w:r>
+              <w:t>8</w:t>
+            </w:r>
+          </w:p>
+        </w:tc>
+      </w:tr>
+      <w:tr>
+        <w:tc>
+          <w:tcPr>
+            <w:tcW w:type="dxa" w:w="1824"/>
+          </w:tcPr>
+          <w:p>
+            <w:r>
+              <w:t>2. Diseño</w:t>
+            </w:r>
+          </w:p>
+        </w:tc>
+        <w:tc>
+          <w:tcPr>
+            <w:tcW w:type="dxa" w:w="1824"/>
+          </w:tcPr>
+          <w:p>
+            <w:r>
+              <w:t>Diseño del esquema de base de datos (ERD)</w:t>
+            </w:r>
+          </w:p>
+        </w:tc>
+        <w:tc>
+          <w:tcPr>
+            <w:tcW w:type="dxa" w:w="1824"/>
+          </w:tcPr>
+          <w:p>
+            <w:r>
+              <w:t>10/03/2026</w:t>
+            </w:r>
+          </w:p>
+        </w:tc>
+        <w:tc>
+          <w:tcPr>
+            <w:tcW w:type="dxa" w:w="1824"/>
+          </w:tcPr>
+          <w:p>
+            <w:r>
+              <w:t>17/03/2026</w:t>
+            </w:r>
+          </w:p>
+        </w:tc>
+        <w:tc>
+          <w:tcPr>
+            <w:tcW w:type="dxa" w:w="1824"/>
+          </w:tcPr>
+          <w:p>
+            <w:r>
+              <w:t>8</w:t>
+            </w:r>
+          </w:p>
+        </w:tc>
+      </w:tr>
+      <w:tr>
+        <w:tc>
+          <w:tcPr>
+            <w:tcW w:type="dxa" w:w="1824"/>
+          </w:tcPr>
+          <w:p>
+            <w:r>
+              <w:t>2. Diseño</w:t>
+            </w:r>
+          </w:p>
+        </w:tc>
+        <w:tc>
+          <w:tcPr>
+            <w:tcW w:type="dxa" w:w="1824"/>
+          </w:tcPr>
+          <w:p>
+            <w:r>
+              <w:t>Diseño de la API REST (endpoints y contratos)</w:t>
+            </w:r>
+          </w:p>
+        </w:tc>
+        <w:tc>
+          <w:tcPr>
+            <w:tcW w:type="dxa" w:w="1824"/>
+          </w:tcPr>
+          <w:p>
+            <w:r>
+              <w:t>13/03/2026</w:t>
+            </w:r>
+          </w:p>
+        </w:tc>
+        <w:tc>
+          <w:tcPr>
+            <w:tcW w:type="dxa" w:w="1824"/>
+          </w:tcPr>
+          <w:p>
+            <w:r>
+              <w:t>18/03/2026</w:t>
+            </w:r>
+          </w:p>
+        </w:tc>
+        <w:tc>
+          <w:tcPr>
+            <w:tcW w:type="dxa" w:w="1824"/>
+          </w:tcPr>
+          <w:p>
+            <w:r>
+              <w:t>6</w:t>
+            </w:r>
+          </w:p>
+        </w:tc>
+      </w:tr>
+      <w:tr>
+        <w:tc>
+          <w:tcPr>
+            <w:tcW w:type="dxa" w:w="1824"/>
+          </w:tcPr>
+          <w:p>
+            <w:r>
+              <w:t>2. Diseño</w:t>
+            </w:r>
+          </w:p>
+        </w:tc>
+        <w:tc>
+          <w:tcPr>
+            <w:tcW w:type="dxa" w:w="1824"/>
+          </w:tcPr>
+          <w:p>
+            <w:r>
+              <w:t>Wireframes de pantallas principales (Figma)</w:t>
+            </w:r>
+          </w:p>
+        </w:tc>
+        <w:tc>
+          <w:tcPr>
+            <w:tcW w:type="dxa" w:w="1824"/>
+          </w:tcPr>
+          <w:p>
+            <w:r>
+              <w:t>15/03/2026</w:t>
+            </w:r>
+          </w:p>
+        </w:tc>
+        <w:tc>
+          <w:tcPr>
+            <w:tcW w:type="dxa" w:w="1824"/>
+          </w:tcPr>
+          <w:p>
+            <w:r>
+              <w:t>18/03/2026</w:t>
+            </w:r>
+          </w:p>
+        </w:tc>
+        <w:tc>
+          <w:tcPr>
+            <w:tcW w:type="dxa" w:w="1824"/>
+          </w:tcPr>
+          <w:p>
+            <w:r>
+              <w:t>4</w:t>
+            </w:r>
+          </w:p>
+        </w:tc>
+      </w:tr>
+      <w:tr>
+        <w:tc>
+          <w:tcPr>
+            <w:tcW w:type="dxa" w:w="1824"/>
+          </w:tcPr>
+          <w:p>
+            <w:r>
+              <w:t>3. Desarrollo — Backend</w:t>
+            </w:r>
+          </w:p>
+        </w:tc>
+        <w:tc>
+          <w:tcPr>
+            <w:tcW w:type="dxa" w:w="1824"/>
+          </w:tcPr>
+          <w:p>
+            <w:r>
+              <w:t>Scaffold del proyecto y esquema inicial de BD</w:t>
+            </w:r>
+          </w:p>
+        </w:tc>
+        <w:tc>
+          <w:tcPr>
+            <w:tcW w:type="dxa" w:w="1824"/>
+          </w:tcPr>
+          <w:p>
+            <w:r>
+              <w:t>18/03/2026</w:t>
+            </w:r>
+          </w:p>
+        </w:tc>
+        <w:tc>
+          <w:tcPr>
+            <w:tcW w:type="dxa" w:w="1824"/>
+          </w:tcPr>
+          <w:p>
+            <w:r>
+              <w:t>18/03/2026</w:t>
+            </w:r>
+          </w:p>
+        </w:tc>
+        <w:tc>
+          <w:tcPr>
+            <w:tcW w:type="dxa" w:w="1824"/>
+          </w:tcPr>
+          <w:p>
+            <w:r>
+              <w:t>1</w:t>
+            </w:r>
+          </w:p>
+        </w:tc>
+      </w:tr>
+      <w:tr>
+        <w:tc>
+          <w:tcPr>
+            <w:tcW w:type="dxa" w:w="1824"/>
+          </w:tcPr>
+          <w:p>
+            <w:r>
+              <w:t>3. Desarrollo — Backend</w:t>
+            </w:r>
+          </w:p>
+        </w:tc>
+        <w:tc>
+          <w:tcPr>
+            <w:tcW w:type="dxa" w:w="1824"/>
+          </w:tcPr>
+          <w:p>
+            <w:r>
+              <w:t>Sistema de autenticación (BCrypt + email)</w:t>
+            </w:r>
+          </w:p>
+        </w:tc>
+        <w:tc>
+          <w:tcPr>
+            <w:tcW w:type="dxa" w:w="1824"/>
+          </w:tcPr>
+          <w:p>
+            <w:r>
+              <w:t>19/03/2026</w:t>
+            </w:r>
+          </w:p>
+        </w:tc>
+        <w:tc>
+          <w:tcPr>
+            <w:tcW w:type="dxa" w:w="1824"/>
+          </w:tcPr>
+          <w:p>
+            <w:r>
+              <w:t>24/03/2026</w:t>
+            </w:r>
+          </w:p>
+        </w:tc>
+        <w:tc>
+          <w:tcPr>
+            <w:tcW w:type="dxa" w:w="1824"/>
+          </w:tcPr>
+          <w:p>
+            <w:r>
+              <w:t>6</w:t>
+            </w:r>
+          </w:p>
+        </w:tc>
+      </w:tr>
+      <w:tr>
+        <w:tc>
+          <w:tcPr>
+            <w:tcW w:type="dxa" w:w="1824"/>
+          </w:tcPr>
+          <w:p>
+            <w:r>
+              <w:t>3. Desarrollo — Backend</w:t>
+            </w:r>
+          </w:p>
+        </w:tc>
+        <w:tc>
+          <w:tcPr>
+            <w:tcW w:type="dxa" w:w="1824"/>
+          </w:tcPr>
+          <w:p>
+            <w:r>
+              <w:t>API de datos de referencia (héroes, enemigos, mundos)</w:t>
+            </w:r>
+          </w:p>
+        </w:tc>
+        <w:tc>
+          <w:tcPr>
+            <w:tcW w:type="dxa" w:w="1824"/>
+          </w:tcPr>
+          <w:p>
+            <w:r>
+              <w:t>25/03/2026</w:t>
+            </w:r>
+          </w:p>
+        </w:tc>
+        <w:tc>
+          <w:tcPr>
+            <w:tcW w:type="dxa" w:w="1824"/>
+          </w:tcPr>
+          <w:p>
+            <w:r>
+              <w:t>29/03/2026</w:t>
+            </w:r>
+          </w:p>
+        </w:tc>
+        <w:tc>
+          <w:tcPr>
+            <w:tcW w:type="dxa" w:w="1824"/>
+          </w:tcPr>
+          <w:p>
+            <w:r>
+              <w:t>5</w:t>
+            </w:r>
+          </w:p>
+        </w:tc>
+      </w:tr>
+      <w:tr>
+        <w:tc>
+          <w:tcPr>
+            <w:tcW w:type="dxa" w:w="1824"/>
+          </w:tcPr>
+          <w:p>
+            <w:r>
+              <w:t>3. Desarrollo — Backend</w:t>
+            </w:r>
+          </w:p>
+        </w:tc>
+        <w:tc>
+          <w:tcPr>
+            <w:tcW w:type="dxa" w:w="1824"/>
+          </w:tcPr>
+          <w:p>
+            <w:r>
+              <w:t>Sistema de progreso (transacciones atómicas, 6 tablas)</w:t>
+            </w:r>
+          </w:p>
+        </w:tc>
+        <w:tc>
+          <w:tcPr>
+            <w:tcW w:type="dxa" w:w="1824"/>
+          </w:tcPr>
+          <w:p>
+            <w:r>
+              <w:t>30/03/2026</w:t>
+            </w:r>
+          </w:p>
+        </w:tc>
+        <w:tc>
+          <w:tcPr>
+            <w:tcW w:type="dxa" w:w="1824"/>
+          </w:tcPr>
+          <w:p>
+            <w:r>
+              <w:t>04/04/2026</w:t>
+            </w:r>
+          </w:p>
+        </w:tc>
+        <w:tc>
+          <w:tcPr>
+            <w:tcW w:type="dxa" w:w="1824"/>
+          </w:tcPr>
+          <w:p>
+            <w:r>
+              <w:t>6</w:t>
+            </w:r>
+          </w:p>
+        </w:tc>
+      </w:tr>
+      <w:tr>
+        <w:tc>
+          <w:tcPr>
+            <w:tcW w:type="dxa" w:w="1824"/>
+          </w:tcPr>
+          <w:p>
+            <w:r>
+              <w:t>3. Desarrollo — Backend</w:t>
+            </w:r>
+          </w:p>
+        </w:tc>
+        <w:tc>
+          <w:tcPr>
+            <w:tcW w:type="dxa" w:w="1824"/>
+          </w:tcPr>
+          <w:p>
+            <w:r>
+              <w:t>Tienda y panel de administración</w:t>
+            </w:r>
+          </w:p>
+        </w:tc>
+        <w:tc>
+          <w:tcPr>
+            <w:tcW w:type="dxa" w:w="1824"/>
+          </w:tcPr>
+          <w:p>
+            <w:r>
+              <w:t>05/04/2026</w:t>
+            </w:r>
+          </w:p>
+        </w:tc>
+        <w:tc>
+          <w:tcPr>
+            <w:tcW w:type="dxa" w:w="1824"/>
+          </w:tcPr>
+          <w:p>
+            <w:r>
+              <w:t>09/04/2026</w:t>
+            </w:r>
+          </w:p>
+        </w:tc>
+        <w:tc>
+          <w:tcPr>
+            <w:tcW w:type="dxa" w:w="1824"/>
+          </w:tcPr>
+          <w:p>
+            <w:r>
+              <w:t>5</w:t>
+            </w:r>
+          </w:p>
+        </w:tc>
+      </w:tr>
+      <w:tr>
+        <w:tc>
+          <w:tcPr>
+            <w:tcW w:type="dxa" w:w="1824"/>
+          </w:tcPr>
+          <w:p>
+            <w:r>
+              <w:t>3. Desarrollo — Backend</w:t>
+            </w:r>
+          </w:p>
+        </w:tc>
+        <w:tc>
+          <w:tcPr>
+            <w:tcW w:type="dxa" w:w="1824"/>
+          </w:tcPr>
+          <w:p>
+            <w:r>
+              <w:t>API de mods comunitarios (crear, publicar, valorar)</w:t>
+            </w:r>
+          </w:p>
+        </w:tc>
+        <w:tc>
+          <w:tcPr>
+            <w:tcW w:type="dxa" w:w="1824"/>
+          </w:tcPr>
+          <w:p>
+            <w:r>
+              <w:t>10/04/2026</w:t>
+            </w:r>
+          </w:p>
+        </w:tc>
+        <w:tc>
+          <w:tcPr>
+            <w:tcW w:type="dxa" w:w="1824"/>
+          </w:tcPr>
+          <w:p>
+            <w:r>
+              <w:t>14/04/2026</w:t>
+            </w:r>
+          </w:p>
+        </w:tc>
+        <w:tc>
+          <w:tcPr>
+            <w:tcW w:type="dxa" w:w="1824"/>
+          </w:tcPr>
+          <w:p>
+            <w:r>
+              <w:t>5</w:t>
+            </w:r>
+          </w:p>
+        </w:tc>
+      </w:tr>
+      <w:tr>
+        <w:tc>
+          <w:tcPr>
+            <w:tcW w:type="dxa" w:w="1824"/>
+          </w:tcPr>
+          <w:p>
+            <w:r>
+              <w:t>3. Desarrollo — Backend</w:t>
+            </w:r>
+          </w:p>
+        </w:tc>
+        <w:tc>
+          <w:tcPr>
+            <w:tcW w:type="dxa" w:w="1824"/>
+          </w:tcPr>
+          <w:p>
+            <w:r>
+              <w:t>Sistema social (follow/unfollow, estadísticas)</w:t>
+            </w:r>
+          </w:p>
+        </w:tc>
+        <w:tc>
+          <w:tcPr>
+            <w:tcW w:type="dxa" w:w="1824"/>
+          </w:tcPr>
+          <w:p>
+            <w:r>
+              <w:t>15/04/2026</w:t>
+            </w:r>
+          </w:p>
+        </w:tc>
+        <w:tc>
+          <w:tcPr>
+            <w:tcW w:type="dxa" w:w="1824"/>
+          </w:tcPr>
+          <w:p>
+            <w:r>
+              <w:t>18/04/2026</w:t>
+            </w:r>
+          </w:p>
+        </w:tc>
+        <w:tc>
+          <w:tcPr>
+            <w:tcW w:type="dxa" w:w="1824"/>
+          </w:tcPr>
+          <w:p>
+            <w:r>
+              <w:t>4</w:t>
+            </w:r>
+          </w:p>
+        </w:tc>
+      </w:tr>
+      <w:tr>
+        <w:tc>
+          <w:tcPr>
+            <w:tcW w:type="dxa" w:w="1824"/>
+          </w:tcPr>
+          <w:p>
+            <w:r>
+              <w:t>3. Desarrollo — Frontend</w:t>
+            </w:r>
+          </w:p>
+        </w:tc>
+        <w:tc>
+          <w:tcPr>
+            <w:tcW w:type="dxa" w:w="1824"/>
+          </w:tcPr>
+          <w:p>
+            <w:r>
+              <w:t>Base SPA, pantalla de login/registro y cliente API</w:t>
+            </w:r>
+          </w:p>
+        </w:tc>
+        <w:tc>
+          <w:tcPr>
+            <w:tcW w:type="dxa" w:w="1824"/>
+          </w:tcPr>
+          <w:p>
+            <w:r>
+              <w:t>19/04/2026</w:t>
+            </w:r>
+          </w:p>
+        </w:tc>
+        <w:tc>
+          <w:tcPr>
+            <w:tcW w:type="dxa" w:w="1824"/>
+          </w:tcPr>
+          <w:p>
+            <w:r>
+              <w:t>23/04/2026</w:t>
+            </w:r>
+          </w:p>
+        </w:tc>
+        <w:tc>
+          <w:tcPr>
+            <w:tcW w:type="dxa" w:w="1824"/>
+          </w:tcPr>
+          <w:p>
+            <w:r>
+              <w:t>5</w:t>
+            </w:r>
+          </w:p>
+        </w:tc>
+      </w:tr>
+      <w:tr>
+        <w:tc>
+          <w:tcPr>
+            <w:tcW w:type="dxa" w:w="1824"/>
+          </w:tcPr>
+          <w:p>
+            <w:r>
+              <w:t>3. Desarrollo — Frontend</w:t>
+            </w:r>
+          </w:p>
+        </w:tc>
+        <w:tc>
+          <w:tcPr>
+            <w:tcW w:type="dxa" w:w="1824"/>
+          </w:tcPr>
+          <w:p>
+            <w:r>
+              <w:t>Motor de batalla ATB (cola de turnos, IA, efectos de estado)</w:t>
+            </w:r>
+          </w:p>
+        </w:tc>
+        <w:tc>
+          <w:tcPr>
+            <w:tcW w:type="dxa" w:w="1824"/>
+          </w:tcPr>
+          <w:p>
+            <w:r>
+              <w:t>24/04/2026</w:t>
+            </w:r>
+          </w:p>
+        </w:tc>
+        <w:tc>
+          <w:tcPr>
+            <w:tcW w:type="dxa" w:w="1824"/>
+          </w:tcPr>
+          <w:p>
+            <w:r>
+              <w:t>28/04/2026</w:t>
+            </w:r>
+          </w:p>
+        </w:tc>
+        <w:tc>
+          <w:tcPr>
+            <w:tcW w:type="dxa" w:w="1824"/>
+          </w:tcPr>
+          <w:p>
+            <w:r>
+              <w:t>5</w:t>
+            </w:r>
+          </w:p>
+        </w:tc>
+      </w:tr>
+      <w:tr>
+        <w:tc>
+          <w:tcPr>
+            <w:tcW w:type="dxa" w:w="1824"/>
+          </w:tcPr>
+          <w:p>
+            <w:r>
+              <w:t>3. Desarrollo — Frontend</w:t>
+            </w:r>
+          </w:p>
+        </w:tc>
+        <w:tc>
+          <w:tcPr>
+            <w:tcW w:type="dxa" w:w="1824"/>
+          </w:tcPr>
+          <w:p>
+            <w:r>
+              <w:t>Mapa de mundos, sistema de checkpoints e intro typewriter</w:t>
+            </w:r>
+          </w:p>
+        </w:tc>
+        <w:tc>
+          <w:tcPr>
+            <w:tcW w:type="dxa" w:w="1824"/>
+          </w:tcPr>
+          <w:p>
+            <w:r>
+              <w:t>29/04/2026</w:t>
+            </w:r>
+          </w:p>
+        </w:tc>
+        <w:tc>
+          <w:tcPr>
+            <w:tcW w:type="dxa" w:w="1824"/>
+          </w:tcPr>
+          <w:p>
+            <w:r>
+              <w:t>04/05/2026</w:t>
+            </w:r>
+          </w:p>
+        </w:tc>
+        <w:tc>
+          <w:tcPr>
+            <w:tcW w:type="dxa" w:w="1824"/>
+          </w:tcPr>
+          <w:p>
+            <w:r>
+              <w:t>6</w:t>
+            </w:r>
+          </w:p>
+        </w:tc>
+      </w:tr>
+      <w:tr>
+        <w:tc>
+          <w:tcPr>
+            <w:tcW w:type="dxa" w:w="1824"/>
+          </w:tcPr>
+          <w:p>
+            <w:r>
+              <w:t>3. Desarrollo — Frontend</w:t>
+            </w:r>
+          </w:p>
+        </w:tc>
+        <w:tc>
+          <w:tcPr>
+            <w:tcW w:type="dxa" w:w="1824"/>
+          </w:tcPr>
+          <w:p>
+            <w:r>
+              <w:t>UI de tienda, perfil de jugador y editor de avatar</w:t>
+            </w:r>
+          </w:p>
+        </w:tc>
+        <w:tc>
+          <w:tcPr>
+            <w:tcW w:type="dxa" w:w="1824"/>
+          </w:tcPr>
+          <w:p>
+            <w:r>
+              <w:t>05/05/2026</w:t>
+            </w:r>
+          </w:p>
+        </w:tc>
+        <w:tc>
+          <w:tcPr>
+            <w:tcW w:type="dxa" w:w="1824"/>
+          </w:tcPr>
+          <w:p>
+            <w:r>
+              <w:t>09/05/2026</w:t>
+            </w:r>
+          </w:p>
+        </w:tc>
+        <w:tc>
+          <w:tcPr>
+            <w:tcW w:type="dxa" w:w="1824"/>
+          </w:tcPr>
+          <w:p>
+            <w:r>
+              <w:t>5</w:t>
+            </w:r>
+          </w:p>
+        </w:tc>
+      </w:tr>
+      <w:tr>
+        <w:tc>
+          <w:tcPr>
+            <w:tcW w:type="dxa" w:w="1824"/>
+          </w:tcPr>
+          <w:p>
+            <w:r>
+              <w:t>3. Desarrollo — Frontend</w:t>
+            </w:r>
+          </w:p>
+        </w:tc>
+        <w:tc>
+          <w:tcPr>
+            <w:tcW w:type="dxa" w:w="1824"/>
+          </w:tcPr>
+          <w:p>
+            <w:r>
+              <w:t>Editor de mapas comunitarios con drag-and-drop</w:t>
+            </w:r>
+          </w:p>
+        </w:tc>
+        <w:tc>
+          <w:tcPr>
+            <w:tcW w:type="dxa" w:w="1824"/>
+          </w:tcPr>
+          <w:p>
+            <w:r>
+              <w:t>10/05/2026</w:t>
+            </w:r>
+          </w:p>
+        </w:tc>
+        <w:tc>
+          <w:tcPr>
+            <w:tcW w:type="dxa" w:w="1824"/>
+          </w:tcPr>
+          <w:p>
+            <w:r>
+              <w:t>15/05/2026</w:t>
+            </w:r>
+          </w:p>
+        </w:tc>
+        <w:tc>
+          <w:tcPr>
+            <w:tcW w:type="dxa" w:w="1824"/>
+          </w:tcPr>
+          <w:p>
+            <w:r>
+              <w:t>6</w:t>
+            </w:r>
+          </w:p>
+        </w:tc>
+      </w:tr>
+      <w:tr>
+        <w:tc>
+          <w:tcPr>
+            <w:tcW w:type="dxa" w:w="1824"/>
+          </w:tcPr>
+          <w:p>
+            <w:r>
+              <w:t>3. Desarrollo — Frontend</w:t>
+            </w:r>
+          </w:p>
+        </w:tc>
+        <w:tc>
+          <w:tcPr>
+            <w:tcW w:type="dxa" w:w="1824"/>
+          </w:tcPr>
+          <w:p>
+            <w:r>
+              <w:t>Explorador de mapas comunitarios y sistema de seguimiento</w:t>
+            </w:r>
+          </w:p>
+        </w:tc>
+        <w:tc>
+          <w:tcPr>
+            <w:tcW w:type="dxa" w:w="1824"/>
+          </w:tcPr>
+          <w:p>
+            <w:r>
+              <w:t>16/05/2026</w:t>
+            </w:r>
+          </w:p>
+        </w:tc>
+        <w:tc>
+          <w:tcPr>
+            <w:tcW w:type="dxa" w:w="1824"/>
+          </w:tcPr>
+          <w:p>
+            <w:r>
+              <w:t>21/05/2026</w:t>
+            </w:r>
+          </w:p>
+        </w:tc>
+        <w:tc>
+          <w:tcPr>
+            <w:tcW w:type="dxa" w:w="1824"/>
+          </w:tcPr>
+          <w:p>
+            <w:r>
+              <w:t>6</w:t>
+            </w:r>
+          </w:p>
+        </w:tc>
+      </w:tr>
+      <w:tr>
+        <w:tc>
+          <w:tcPr>
+            <w:tcW w:type="dxa" w:w="1824"/>
+          </w:tcPr>
+          <w:p>
+            <w:r>
+              <w:t>4. Pruebas</w:t>
+            </w:r>
+          </w:p>
+        </w:tc>
+        <w:tc>
+          <w:tcPr>
+            <w:tcW w:type="dxa" w:w="1824"/>
+          </w:tcPr>
+          <w:p>
+            <w:r>
+              <w:t>Pruebas funcionales del motor de batalla y la API</w:t>
+            </w:r>
+          </w:p>
+        </w:tc>
+        <w:tc>
+          <w:tcPr>
+            <w:tcW w:type="dxa" w:w="1824"/>
+          </w:tcPr>
+          <w:p>
+            <w:r>
+              <w:t>21/05/2026</w:t>
+            </w:r>
+          </w:p>
+        </w:tc>
+        <w:tc>
+          <w:tcPr>
+            <w:tcW w:type="dxa" w:w="1824"/>
+          </w:tcPr>
+          <w:p>
+            <w:r>
+              <w:t>27/05/2026</w:t>
+            </w:r>
+          </w:p>
+        </w:tc>
+        <w:tc>
+          <w:tcPr>
+            <w:tcW w:type="dxa" w:w="1824"/>
+          </w:tcPr>
+          <w:p>
+            <w:r>
+              <w:t>7</w:t>
+            </w:r>
+          </w:p>
+        </w:tc>
+      </w:tr>
+      <w:tr>
+        <w:tc>
+          <w:tcPr>
+            <w:tcW w:type="dxa" w:w="1824"/>
+          </w:tcPr>
+          <w:p>
+            <w:r>
+              <w:t>4. Pruebas</w:t>
+            </w:r>
+          </w:p>
+        </w:tc>
+        <w:tc>
+          <w:tcPr>
+            <w:tcW w:type="dxa" w:w="1824"/>
+          </w:tcPr>
+          <w:p>
+            <w:r>
+              <w:t>Pruebas de integridad de BD y corrección de bugs</w:t>
+            </w:r>
+          </w:p>
+        </w:tc>
+        <w:tc>
+          <w:tcPr>
+            <w:tcW w:type="dxa" w:w="1824"/>
+          </w:tcPr>
+          <w:p>
+            <w:r>
+              <w:t>22/05/2026</w:t>
+            </w:r>
+          </w:p>
+        </w:tc>
+        <w:tc>
+          <w:tcPr>
+            <w:tcW w:type="dxa" w:w="1824"/>
+          </w:tcPr>
+          <w:p>
+            <w:r>
+              <w:t>27/05/2026</w:t>
+            </w:r>
+          </w:p>
+        </w:tc>
+        <w:tc>
+          <w:tcPr>
+            <w:tcW w:type="dxa" w:w="1824"/>
+          </w:tcPr>
+          <w:p>
+            <w:r>
+              <w:t>6</w:t>
+            </w:r>
+          </w:p>
+        </w:tc>
+      </w:tr>
+      <w:tr>
+        <w:tc>
+          <w:tcPr>
+            <w:tcW w:type="dxa" w:w="1824"/>
+          </w:tcPr>
+          <w:p>
+            <w:r>
+              <w:t>5. Documentación</w:t>
+            </w:r>
+          </w:p>
+        </w:tc>
+        <w:tc>
+          <w:tcPr>
+            <w:tcW w:type="dxa" w:w="1824"/>
+          </w:tcPr>
+          <w:p>
+            <w:r>
+              <w:t>Redacción de referencia técnica y documento TFG</w:t>
+            </w:r>
+          </w:p>
+        </w:tc>
+        <w:tc>
+          <w:tcPr>
+            <w:tcW w:type="dxa" w:w="1824"/>
+          </w:tcPr>
+          <w:p>
+            <w:r>
+              <w:t>28/05/2026</w:t>
+            </w:r>
+          </w:p>
+        </w:tc>
+        <w:tc>
+          <w:tcPr>
+            <w:tcW w:type="dxa" w:w="1824"/>
+          </w:tcPr>
+          <w:p>
+            <w:r>
+              <w:t>31/05/2026</w:t>
+            </w:r>
+          </w:p>
+        </w:tc>
+        <w:tc>
+          <w:tcPr>
+            <w:tcW w:type="dxa" w:w="1824"/>
+          </w:tcPr>
+          <w:p>
+            <w:r>
+              <w:t>4</w:t>
+            </w:r>
+          </w:p>
+        </w:tc>
+      </w:tr>
+    </w:tbl>
+    <w:p/>
+    <w:p>
+      <w:pPr>
         <w:jc w:val="center"/>
         <w:shd w:val="clear" w:color="auto" w:fill="D9E2F3"/>
       </w:pPr>
@@ -981,7 +2167,7 @@
           <w:color w:val="888888"/>
           <w:sz w:val="20"/>
         </w:rPr>
-        <w:t xml:space="preserve">  INSERTAR DIAGRAMA DE GANTT — Planificación temporal del proyecto  </w:t>
+        <w:t xml:space="preserve">  INSERTAR DIAGRAMA DE GANTT — Generado a partir de la tabla anterior  </w:t>
       </w:r>
     </w:p>
     <w:p/>
@@ -995,7 +2181,7 @@
           <w:color w:val="606060"/>
           <w:sz w:val="18"/>
         </w:rPr>
-        <w:t>INSERTAR DIAGRAMA DE GANTT — Planificación temporal del proyecto</w:t>
+        <w:t>INSERTAR DIAGRAMA DE GANTT — Generado a partir de la tabla anterior</w:t>
       </w:r>
     </w:p>
     <w:p/>
@@ -1076,17 +2262,17 @@
           </w:tcPr>
           <w:p>
             <w:r>
+              <w:t>18 h</w:t>
+            </w:r>
+          </w:p>
+        </w:tc>
+        <w:tc>
+          <w:tcPr>
+            <w:tcW w:type="dxa" w:w="3041"/>
+          </w:tcPr>
+          <w:p>
+            <w:r>
               <w:t>20 h</w:t>
-            </w:r>
-          </w:p>
-        </w:tc>
-        <w:tc>
-          <w:tcPr>
-            <w:tcW w:type="dxa" w:w="3041"/>
-          </w:tcPr>
-          <w:p>
-            <w:r>
-              <w:t>25 h</w:t>
             </w:r>
           </w:p>
         </w:tc>
@@ -1108,7 +2294,7 @@
           </w:tcPr>
           <w:p>
             <w:r>
-              <w:t>30 h</w:t>
+              <w:t>18 h</w:t>
             </w:r>
           </w:p>
         </w:tc>
@@ -1118,7 +2304,7 @@
           </w:tcPr>
           <w:p>
             <w:r>
-              <w:t>35 h</w:t>
+              <w:t>20 h</w:t>
             </w:r>
           </w:p>
         </w:tc>
@@ -1140,7 +2326,7 @@
           </w:tcPr>
           <w:p>
             <w:r>
-              <w:t>80 h</w:t>
+              <w:t>55 h</w:t>
             </w:r>
           </w:p>
         </w:tc>
@@ -1150,7 +2336,7 @@
           </w:tcPr>
           <w:p>
             <w:r>
-              <w:t>90 h</w:t>
+              <w:t>62 h</w:t>
             </w:r>
           </w:p>
         </w:tc>
@@ -1172,7 +2358,7 @@
           </w:tcPr>
           <w:p>
             <w:r>
-              <w:t>80 h</w:t>
+              <w:t>75 h</w:t>
             </w:r>
           </w:p>
         </w:tc>
@@ -1182,7 +2368,7 @@
           </w:tcPr>
           <w:p>
             <w:r>
-              <w:t>95 h</w:t>
+              <w:t>88 h</w:t>
             </w:r>
           </w:p>
         </w:tc>
@@ -1204,7 +2390,7 @@
           </w:tcPr>
           <w:p>
             <w:r>
-              <w:t>30 h</w:t>
+              <w:t>14 h</w:t>
             </w:r>
           </w:p>
         </w:tc>
@@ -1214,7 +2400,7 @@
           </w:tcPr>
           <w:p>
             <w:r>
-              <w:t>40 h</w:t>
+              <w:t>18 h</w:t>
             </w:r>
           </w:p>
         </w:tc>
@@ -1236,7 +2422,7 @@
           </w:tcPr>
           <w:p>
             <w:r>
-              <w:t>25 h</w:t>
+              <w:t>12 h</w:t>
             </w:r>
           </w:p>
         </w:tc>
@@ -1246,7 +2432,7 @@
           </w:tcPr>
           <w:p>
             <w:r>
-              <w:t>30 h</w:t>
+              <w:t>15 h</w:t>
             </w:r>
           </w:p>
         </w:tc>
@@ -1268,7 +2454,7 @@
           </w:tcPr>
           <w:p>
             <w:r>
-              <w:t>265 h</w:t>
+              <w:t>192 h</w:t>
             </w:r>
           </w:p>
         </w:tc>
@@ -1278,7 +2464,7 @@
           </w:tcPr>
           <w:p>
             <w:r>
-              <w:t>315 h</w:t>
+              <w:t>223 h</w:t>
             </w:r>
           </w:p>
         </w:tc>

</xml_diff>

<commit_message>
fix: correct tech stack — React 18, plain JavaScript/JSX, Babel Standalone (not TypeScript/React 19)
</commit_message>
<xml_diff>
--- a/DAW_Defending_a_Workstation_TFG.docx
+++ b/DAW_Defending_a_Workstation_TFG.docx
@@ -774,7 +774,7 @@
         <w:ind w:left="0"/>
       </w:pPr>
       <w:r>
-        <w:t>Implementar el motor de combate ATB (Active Time Battle) en React 19 con TypeScript, sin dependencia de ningún motor de juego externo.</w:t>
+        <w:t>Implementar el motor de combate ATB (Active Time Battle) en React 18 con JavaScript (JSX), sin dependencia de ningún motor de juego externo.</w:t>
       </w:r>
     </w:p>
     <w:p>
@@ -911,7 +911,7 @@
           <w:b w:val="0"/>
           <w:i w:val="0"/>
         </w:rPr>
-        <w:t>Implementación del backend (.NET 9, C#, Dapper, MySQL), del frontend (React, TypeScript, Vite) y de la base de datos. Integración progresiva de ambas capas.</w:t>
+        <w:t>Implementación del backend (.NET 9, C#, Dapper, MySQL), del frontend (React, JavaScript/JSX, Babel Standalone, Vite) y de la base de datos. Integración progresiva de ambas capas.</w:t>
       </w:r>
     </w:p>
     <w:p>
@@ -3236,7 +3236,7 @@
         <w:pStyle w:val="Heading2"/>
       </w:pPr>
       <w:r>
-        <w:t>React 19</w:t>
+        <w:t>React 18</w:t>
       </w:r>
     </w:p>
     <w:p>
@@ -3248,7 +3248,7 @@
           <w:b w:val="0"/>
           <w:i w:val="0"/>
         </w:rPr>
-        <w:t>React es la biblioteca principal de construcción de interfaces de usuario del frontend. Es la opción más madura y extendida del ecosistema JavaScript, con una comunidad enorme, documentación excelente y un modelo de componentes que escala bien para proyectos complejos.</w:t>
+        <w:t>React es la biblioteca principal de construcción de interfaces de usuario del frontend. Es la opción más madura y extendida del ecosistema JavaScript, con una comunidad enorme, documentación excelente y un modelo de componentes que escala bien para proyectos complejos. El juego carga React 18.3.1 directamente desde CDN (unpkg) como bundle UMD, lo que elimina cualquier dependencia de un paso de compilación para el cliente final.</w:t>
       </w:r>
     </w:p>
     <w:p>
@@ -3270,7 +3270,7 @@
         <w:ind w:left="0"/>
       </w:pPr>
       <w:r>
-        <w:t>Hooks (useState, useEffect, useCallback): permiten gestionar el estado del juego y el game loop de forma declarativa sin necesidad de un motor externo.</w:t>
+        <w:t>Hooks (useState, useEffect, useCallback, useRef): permiten gestionar el estado del juego y el game loop de forma declarativa sin necesidad de un motor externo.</w:t>
       </w:r>
     </w:p>
     <w:p>
@@ -3280,7 +3280,7 @@
         <w:ind w:left="0"/>
       </w:pPr>
       <w:r>
-        <w:t>React Context: permite compartir el estado global de la partida (equipo, inventario, progreso) entre componentes sin prop drilling.</w:t>
+        <w:t>React Context: permite compartir el estado global de la partida (equipo, inventario, progreso) entre componentes sin necesidad de prop drilling.</w:t>
       </w:r>
     </w:p>
     <w:p>
@@ -3290,17 +3290,7 @@
         <w:ind w:left="0"/>
       </w:pPr>
       <w:r>
-        <w:t>Ecosistema maduro: react-router-dom para la navegación SPA, TypeScript para tipado, Vite para build.</w:t>
-      </w:r>
-    </w:p>
-    <w:p>
-      <w:pPr>
-        <w:pStyle w:val="ListBullet"/>
-        <w:spacing w:after="60"/>
-        <w:ind w:left="0"/>
-      </w:pPr>
-      <w:r>
-        <w:t>La versión 19 introduce mejoras de rendimiento en el reconciliador que benefician al game loop.</w:t>
+        <w:t>Carga desde CDN: el bundle UMD de React no requiere compilación, lo que hace el juego ejecutable directamente en el navegador sin herramientas de build.</w:t>
       </w:r>
     </w:p>
     <w:p>
@@ -3308,7 +3298,7 @@
         <w:pStyle w:val="Heading2"/>
       </w:pPr>
       <w:r>
-        <w:t>TypeScript 6</w:t>
+        <w:t>JavaScript (JSX) y Babel Standalone</w:t>
       </w:r>
     </w:p>
     <w:p>
@@ -3320,15 +3310,7 @@
           <w:b w:val="0"/>
           <w:i w:val="0"/>
         </w:rPr>
-        <w:t>TypeScript añade tipado estático a JavaScript. En un proyecto con un motor de batalla, tipos de datos complejos (héroes, habilidades, estados de combate) y múltiples componentes interactuando, el tipado es esencial para evitar errores en tiempo de ejecución y para que el código sea autoexplicativo. Sin TypeScript, un motor de batalla de esta complejidad sería muy difícil de mantener.</w:t>
-      </w:r>
-    </w:p>
-    <w:p>
-      <w:pPr>
-        <w:pStyle w:val="Heading2"/>
-      </w:pPr>
-      <w:r>
-        <w:t>Vite 8</w:t>
+        <w:t>Todo el código del juego está escrito en JavaScript con sintaxis JSX. No se usa TypeScript en ningún fichero del juego: todos los módulos tienen extensión .jsx y son JavaScript puro. Para que el navegador pueda interpretar JSX sin un paso de compilación, el proyecto carga Babel Standalone 7.29.0 desde CDN y declara los scripts del juego con type="text/babel", lo que permite al navegador transpilar el JSX en tiempo de ejecución.</w:t>
       </w:r>
     </w:p>
     <w:p>
@@ -3340,7 +3322,57 @@
           <w:b w:val="0"/>
           <w:i w:val="0"/>
         </w:rPr>
-        <w:t>Vite es la herramienta de build y servidor de desarrollo. Es significativamente más rápido que Webpack o Create React App gracias a que sirve los módulos directamente en ESModules durante el desarrollo, sin bundling previo. El tiempo de arranque del servidor de desarrollo es prácticamente inmediato, y el build de producción genera bundles optimizados con code splitting automático.</w:t>
+        <w:t>Ventajas de este enfoque frente a un bundle compilado:</w:t>
+      </w:r>
+    </w:p>
+    <w:p>
+      <w:pPr>
+        <w:pStyle w:val="ListBullet"/>
+        <w:spacing w:after="60"/>
+        <w:ind w:left="0"/>
+      </w:pPr>
+      <w:r>
+        <w:t>Sin paso de build: cualquier cambio en un fichero .jsx es visible al recargar el navegador, sin esperar a que Vite o Webpack recompile.</w:t>
+      </w:r>
+    </w:p>
+    <w:p>
+      <w:pPr>
+        <w:pStyle w:val="ListBullet"/>
+        <w:spacing w:after="60"/>
+        <w:ind w:left="0"/>
+      </w:pPr>
+      <w:r>
+        <w:t>Sin configuración de compilador: no hay tsconfig.json ni webpack.config.js que mantener para el juego.</w:t>
+      </w:r>
+    </w:p>
+    <w:p>
+      <w:pPr>
+        <w:pStyle w:val="ListBullet"/>
+        <w:spacing w:after="60"/>
+        <w:ind w:left="0"/>
+      </w:pPr>
+      <w:r>
+        <w:t>Ficheros independientes: cada módulo del juego (daw-battle.jsx, daw-map.jsx, etc.) es un script cargado en orden, fácil de depurar individualmente.</w:t>
+      </w:r>
+    </w:p>
+    <w:p>
+      <w:pPr>
+        <w:pStyle w:val="Heading2"/>
+      </w:pPr>
+      <w:r>
+        <w:t>Vite 8</w:t>
+      </w:r>
+    </w:p>
+    <w:p>
+      <w:pPr>
+        <w:spacing w:after="120"/>
+      </w:pPr>
+      <w:r>
+        <w:rPr>
+          <w:b w:val="0"/>
+          <w:i w:val="0"/>
+        </w:rPr>
+        <w:t>Vite se usa exclusivamente como servidor de desarrollo local. Su función en este proyecto es servir los ficheros estáticos de dawrpg-frontend/ (incluidos los .jsx del juego) con recarga automática cuando se edita cualquier fichero. No se usa el pipeline de build de Vite para el juego: no hay bundling, no hay transpilación de TypeScript para el código del juego, y el build de producción simplemente copiaría los ficheros tal cual.</w:t>
       </w:r>
     </w:p>
     <w:p>
@@ -3592,7 +3624,7 @@
         <w:ind w:left="0"/>
       </w:pPr>
       <w:r>
-        <w:t>Capa de presentación: SPA React 19 + TypeScript (puerto 5173 en desarrollo).</w:t>
+        <w:t>Capa de presentación: SPA React 18 + JavaScript/JSX + Babel Standalone (puerto 5173 en desarrollo).</w:t>
       </w:r>
     </w:p>
     <w:p>
@@ -5737,7 +5769,7 @@
         <w:pStyle w:val="Heading2"/>
       </w:pPr>
       <w:r>
-        <w:t>Frontend — React 19 / TypeScript</w:t>
+        <w:t>Frontend — React 18 / JavaScript (JSX)</w:t>
       </w:r>
     </w:p>
     <w:p>
@@ -5745,7 +5777,7 @@
         <w:pStyle w:val="Heading3"/>
       </w:pPr>
       <w:r>
-        <w:t>src/types/game.ts — Modelo de tipos</w:t>
+        <w:t>Estructura de datos del juego</w:t>
       </w:r>
     </w:p>
     <w:p>
@@ -5757,7 +5789,65 @@
           <w:b w:val="0"/>
           <w:i w:val="0"/>
         </w:rPr>
-        <w:t>game.ts centraliza todas las interfaces TypeScript del sistema de juego. Definir los tipos en un único fichero garantiza que el motor de batalla, los datos estáticos y los componentes React compartan exactamente el mismo contrato de datos, eliminando discrepancias en tiempo de compilación.</w:t>
+        <w:t>Los datos del juego se definen como objetos JavaScript literales directamente en los ficheros del módulo correspondiente. Las principales estructuras que circulan entre componentes son:</w:t>
+      </w:r>
+    </w:p>
+    <w:p>
+      <w:pPr>
+        <w:pStyle w:val="ListBullet"/>
+        <w:spacing w:after="60"/>
+        <w:ind w:left="0"/>
+      </w:pPr>
+      <w:r>
+        <w:t>Héroe — id, name, hp, maxHp, mp, maxMp, speed, abilities[], status[]</w:t>
+      </w:r>
+    </w:p>
+    <w:p>
+      <w:pPr>
+        <w:pStyle w:val="ListBullet"/>
+        <w:spacing w:after="60"/>
+        <w:ind w:left="0"/>
+      </w:pPr>
+      <w:r>
+        <w:t>Enemigo — id, name, hp, maxHp, damage, speed, reward</w:t>
+      </w:r>
+    </w:p>
+    <w:p>
+      <w:pPr>
+        <w:pStyle w:val="ListBullet"/>
+        <w:spacing w:after="60"/>
+        <w:ind w:left="0"/>
+      </w:pPr>
+      <w:r>
+        <w:t>Habilidad — id, name, type (damage|heal|buff|debuff), power, mpCost, target</w:t>
+      </w:r>
+    </w:p>
+    <w:p>
+      <w:pPr>
+        <w:pStyle w:val="ListBullet"/>
+        <w:spacing w:after="60"/>
+        <w:ind w:left="0"/>
+      </w:pPr>
+      <w:r>
+        <w:t>Estado de batalla — heroes[], enemies[], turnQueue[], currentTurn, log[], phase</w:t>
+      </w:r>
+    </w:p>
+    <w:p>
+      <w:pPr>
+        <w:pStyle w:val="ListBullet"/>
+        <w:spacing w:after="60"/>
+        <w:ind w:left="0"/>
+      </w:pPr>
+      <w:r>
+        <w:t>Nodo de mundo — id, worldId, type, position, cleared, dialogue[], reward[]</w:t>
+      </w:r>
+    </w:p>
+    <w:p>
+      <w:pPr>
+        <w:pStyle w:val="Heading3"/>
+      </w:pPr>
+      <w:r>
+        <w:t>daw-app.jsx — Estado global y enrutamiento</w:t>
       </w:r>
     </w:p>
     <w:p>
@@ -5769,67 +5859,7 @@
           <w:b w:val="0"/>
           <w:i w:val="0"/>
         </w:rPr>
-        <w:t>Las interfaces principales son:</w:t>
-      </w:r>
-    </w:p>
-    <w:p>
-      <w:pPr>
-        <w:pStyle w:val="ListBullet"/>
-        <w:spacing w:after="60"/>
-        <w:ind w:left="0"/>
-      </w:pPr>
-      <w:r>
-        <w:t>Hero — id, name, hp, maxHp, mp, maxMp, speed, abilities[], status[]</w:t>
-      </w:r>
-    </w:p>
-    <w:p>
-      <w:pPr>
-        <w:pStyle w:val="ListBullet"/>
-        <w:spacing w:after="60"/>
-        <w:ind w:left="0"/>
-      </w:pPr>
-      <w:r>
-        <w:t>Enemy — id, name, hp, maxHp, damage, speed, reward</w:t>
-      </w:r>
-    </w:p>
-    <w:p>
-      <w:pPr>
-        <w:pStyle w:val="ListBullet"/>
-        <w:spacing w:after="60"/>
-        <w:ind w:left="0"/>
-      </w:pPr>
-      <w:r>
-        <w:t>Ability — id, name, type (damage|heal|buff|debuff), power, mpCost, target</w:t>
-      </w:r>
-    </w:p>
-    <w:p>
-      <w:pPr>
-        <w:pStyle w:val="ListBullet"/>
-        <w:spacing w:after="60"/>
-        <w:ind w:left="0"/>
-      </w:pPr>
-      <w:r>
-        <w:t>BattleState — heroes[], enemies[], turnQueue[], currentTurn, log[], phase</w:t>
-      </w:r>
-    </w:p>
-    <w:p>
-      <w:pPr>
-        <w:pStyle w:val="ListBullet"/>
-        <w:spacing w:after="60"/>
-        <w:ind w:left="0"/>
-      </w:pPr>
-      <w:r>
-        <w:t>Stage — id, worldId, name, nodeType, enemies[]</w:t>
-      </w:r>
-    </w:p>
-    <w:p>
-      <w:pPr>
-        <w:pStyle w:val="ListBullet"/>
-        <w:spacing w:after="60"/>
-        <w:ind w:left="0"/>
-      </w:pPr>
-      <w:r>
-        <w:t>WorldNode — id, worldId, type, position, cleared</w:t>
+        <w:t>daw-app.jsx es el componente raíz del juego. Gestiona el estado global de la partida (equipo del jugador, inventario, progreso, monedero) y lo expone a los componentes hijos mediante props. También implementa el enrutamiento entre pantallas (mapa, batalla, tienda, perfil, editor) y dispara la carga y guardado de progreso contra la API.</w:t>
       </w:r>
     </w:p>
     <w:p>
@@ -5837,7 +5867,7 @@
         <w:pStyle w:val="Heading3"/>
       </w:pPr>
       <w:r>
-        <w:t>src/context/GameContext.jsx — Estado global</w:t>
+        <w:t>daw-map.jsx — Mapa de mundos</w:t>
       </w:r>
     </w:p>
     <w:p>
@@ -5849,27 +5879,7 @@
           <w:b w:val="0"/>
           <w:i w:val="0"/>
         </w:rPr>
-        <w:t>GameContext implementa el contexto global de la partida mediante React Context API. Almacena el estado cargado desde la API (equipo del jugador, inventario, progreso, monedero) y lo expone a todos los componentes sin necesidad de prop drilling. Cuando el jugador guarda la partida, GameContext también dispara la llamada a la API.</w:t>
-      </w:r>
-    </w:p>
-    <w:p>
-      <w:pPr>
-        <w:pStyle w:val="Heading3"/>
-      </w:pPr>
-      <w:r>
-        <w:t>src/pages/MapPage.tsx — Mapa de mundos</w:t>
-      </w:r>
-    </w:p>
-    <w:p>
-      <w:pPr>
-        <w:spacing w:after="120"/>
-      </w:pPr>
-      <w:r>
-        <w:rPr>
-          <w:b w:val="0"/>
-          <w:i w:val="0"/>
-        </w:rPr>
-        <w:t>MapPage renderiza el mapa de selección de mundos y nodos. Recibe la estructura de mundos desde la API (nodos + aristas) y la dibuja como un grafo de navegación. Los nodos completados aparecen marcados, y los nodos bloqueados no son seleccionables. Al hacer clic en un nodo disponible, el router navega a /battle/:id.</w:t>
+        <w:t>daw-map.jsx renderiza el mapa de selección de mundos y nodos mediante un SVG. Recibe la estructura de mundos desde la API (nodos + aristas) y la dibuja como un grafo de navegación. Los nodos completados aparecen marcados, los bloqueados no son seleccionables, y al entrar en un nodo se ejecuta la lógica correspondiente (combate, tienda, checkpoint, etc.).</w:t>
       </w:r>
     </w:p>
     <w:p>
@@ -6048,7 +6058,7 @@
         <w:pStyle w:val="Heading3"/>
       </w:pPr>
       <w:r>
-        <w:t>src/pages/BattlePage.tsx — Motor de batalla ATB</w:t>
+        <w:t>daw-battle.jsx — Motor de batalla ATB</w:t>
       </w:r>
     </w:p>
     <w:p>
@@ -6060,7 +6070,7 @@
           <w:b w:val="0"/>
           <w:i w:val="0"/>
         </w:rPr>
-        <w:t>BattlePage.tsx (~675 líneas) implementa el motor de batalla completo. Es el componente más complejo del proyecto, ya que gestiona un game loop reactivo dentro del modelo de React basado en eventos.</w:t>
+        <w:t>daw-battle.jsx (~700 líneas) implementa el motor de batalla completo. Es el componente más complejo del proyecto, ya que gestiona un game loop reactivo dentro del modelo de React basado en eventos.</w:t>
       </w:r>
     </w:p>
     <w:p>
@@ -6334,7 +6344,19 @@
         <w:pStyle w:val="Heading3"/>
       </w:pPr>
       <w:r>
-        <w:t>src/data/ — Datos estáticos del juego</w:t>
+        <w:t>Datos estáticos del juego</w:t>
+      </w:r>
+    </w:p>
+    <w:p>
+      <w:pPr>
+        <w:spacing w:after="120"/>
+      </w:pPr>
+      <w:r>
+        <w:rPr>
+          <w:b w:val="0"/>
+          <w:i w:val="0"/>
+        </w:rPr>
+        <w:t>Los datos de referencia del juego (héroes, enemigos, mundos) están definidos como constantes JavaScript dentro de los propios ficheros que los usan, y se cargan adicionalmente desde la API al iniciar la sesión para sincronizar con la base de datos.</w:t>
       </w:r>
     </w:p>
     <w:tbl>
@@ -6382,7 +6404,7 @@
           </w:tcPr>
           <w:p>
             <w:r>
-              <w:t>characters.ts</w:t>
+              <w:t>daw-battle.jsx</w:t>
             </w:r>
           </w:p>
         </w:tc>
@@ -6392,7 +6414,7 @@
           </w:tcPr>
           <w:p>
             <w:r>
-              <w:t>6 héroes con estadísticas base y 4 habilidades cada uno</w:t>
+              <w:t>Definición de los 6 héroes con estadísticas y 4 habilidades cada uno</w:t>
             </w:r>
           </w:p>
         </w:tc>
@@ -6404,7 +6426,7 @@
           </w:tcPr>
           <w:p>
             <w:r>
-              <w:t>enemies.ts</w:t>
+              <w:t>daw-battle.jsx</w:t>
             </w:r>
           </w:p>
         </w:tc>
@@ -6414,7 +6436,7 @@
           </w:tcPr>
           <w:p>
             <w:r>
-              <w:t>7 enemigos con HP, daño, velocidad y recompensa en monedas</w:t>
+              <w:t>Definición de los 7 tipos de enemigos con HP, daño y recompensa</w:t>
             </w:r>
           </w:p>
         </w:tc>
@@ -6426,7 +6448,7 @@
           </w:tcPr>
           <w:p>
             <w:r>
-              <w:t>stages.ts</w:t>
+              <w:t>daw-map.jsx</w:t>
             </w:r>
           </w:p>
         </w:tc>
@@ -6436,7 +6458,7 @@
           </w:tcPr>
           <w:p>
             <w:r>
-              <w:t>31 nodos con tipo (combate, tienda, save, jefe) y enemigos asignados</w:t>
+              <w:t>Definición de los 3 mundos con sus nodos, aristas y configuración de checkpoints</w:t>
             </w:r>
           </w:p>
         </w:tc>
@@ -8190,7 +8212,7 @@
         <w:rPr>
           <w:sz w:val="20"/>
         </w:rPr>
-        <w:t>[4]  Meta Open Source. (2024). React 19 documentation. https://react.dev/</w:t>
+        <w:t>[4]  Meta Open Source. (2024). React documentation. https://react.dev/</w:t>
       </w:r>
     </w:p>
     <w:p>
@@ -8214,7 +8236,7 @@
         <w:rPr>
           <w:sz w:val="20"/>
         </w:rPr>
-        <w:t>[6]  TypeScript. (2024). TypeScript documentation. https://www.typescriptlang.org/docs/</w:t>
+        <w:t>[6]  Babel. (2024). Babel Standalone — in-browser JSX transpilation. https://babeljs.io/docs/babel-standalone</w:t>
       </w:r>
     </w:p>
     <w:p>

</xml_diff>